<commit_message>
feat: expand letter templates and admin workflow
</commit_message>
<xml_diff>
--- a/templates_surat/active/3. Surat Tugas-smada.docx
+++ b/templates_surat/active/3. Surat Tugas-smada.docx
@@ -109,7 +109,7 @@
           <w:u w:val="single"/>
           <w:szCs w:val="28"/>
         </w:rPr>
-        <w:t>SURAT TUGAS</w:t>
+        <w:t>SURAT PERINTAH / SURAT TUGAS</w:t>
       </w:r>
     </w:p>
     <w:p>
@@ -127,23 +127,6 @@
           <w:szCs w:val="24"/>
         </w:rPr>
         <w:t>Nomor: {{ nomor_surat }}</w:t>
-      </w:r>
-    </w:p>
-    <w:p>
-      <w:pPr>
-        <w:keepNext/>
-        <w:spacing w:before="0" w:after="120" w:line="276" w:lineRule="auto"/>
-        <w:jc w:val="both"/>
-      </w:pPr>
-      <w:r>
-        <w:rPr>
-          <w:rFonts w:ascii="Times New Roman" w:hAnsi="Times New Roman" w:eastAsia="Times New Roman" w:cs="Times New Roman"/>
-          <w:b w:val="0"/>
-          <w:sz w:val="24"/>
-          <w:u w:val="none"/>
-          <w:szCs w:val="24"/>
-        </w:rPr>
-        <w:t>Kepala SMA Negeri 2 Wonosari dengan ini menugaskan kepada:</w:t>
       </w:r>
     </w:p>
     <w:tbl>
@@ -199,7 +182,7 @@
                 <w:sz w:val="24"/>
                 <w:szCs w:val="24"/>
               </w:rPr>
-              <w:t>Nama</w:t>
+              <w:t>Dasar</w:t>
             </w:r>
           </w:p>
         </w:tc>
@@ -265,15 +248,404 @@
             <w:r>
               <w:rPr>
                 <w:rFonts w:ascii="Times New Roman" w:hAnsi="Times New Roman" w:eastAsia="Times New Roman" w:cs="Times New Roman"/>
+                <w:b w:val="0"/>
+                <w:sz w:val="24"/>
+                <w:szCs w:val="24"/>
+              </w:rPr>
+              <w:t>{{ dasar }}</w:t>
+            </w:r>
+          </w:p>
+        </w:tc>
+      </w:tr>
+    </w:tbl>
+    <w:p>
+      <w:pPr>
+        <w:keepNext/>
+        <w:spacing w:before="160" w:after="80" w:line="276" w:lineRule="auto"/>
+        <w:jc w:val="center"/>
+      </w:pPr>
+      <w:r>
+        <w:rPr>
+          <w:rFonts w:ascii="Times New Roman" w:hAnsi="Times New Roman" w:eastAsia="Times New Roman" w:cs="Times New Roman"/>
+          <w:b/>
+          <w:sz w:val="24"/>
+          <w:u w:val="none"/>
+          <w:szCs w:val="24"/>
+        </w:rPr>
+        <w:t>MEMERINTAHKAN:</w:t>
+      </w:r>
+    </w:p>
+    <w:p>
+      <w:pPr>
+        <w:keepNext/>
+        <w:spacing w:before="0" w:after="0" w:line="276" w:lineRule="auto"/>
+        <w:jc w:val="left"/>
+      </w:pPr>
+      <w:r>
+        <w:rPr>
+          <w:rFonts w:ascii="Times New Roman" w:hAnsi="Times New Roman" w:eastAsia="Times New Roman" w:cs="Times New Roman"/>
+          <w:b/>
+          <w:sz w:val="24"/>
+          <w:u w:val="none"/>
+          <w:szCs w:val="24"/>
+        </w:rPr>
+        <w:t>Kepada:</w:t>
+      </w:r>
+    </w:p>
+    <w:tbl>
+      <w:tblPr>
+        <w:tblW w:type="dxa" w:w="9071"/>
+        <w:jc w:val="left"/>
+        <w:tblLayout w:type="fixed"/>
+        <w:tblLook w:firstColumn="1" w:firstRow="1" w:lastColumn="0" w:lastRow="0" w:noHBand="0" w:noVBand="1" w:val="04A0"/>
+        <w:tblInd w:w="0" w:type="dxa"/>
+        <w:tblBorders>
+          <w:top w:val="single" w:sz="4" w:color="808080"/>
+          <w:left w:val="single" w:sz="4" w:color="808080"/>
+          <w:bottom w:val="single" w:sz="4" w:color="808080"/>
+          <w:right w:val="single" w:sz="4" w:color="808080"/>
+          <w:insideH w:val="single" w:sz="4" w:color="808080"/>
+          <w:insideV w:val="single" w:sz="4" w:color="808080"/>
+        </w:tblBorders>
+      </w:tblPr>
+      <w:tblGrid>
+        <w:gridCol w:w="650"/>
+        <w:gridCol w:w="5000"/>
+        <w:gridCol w:w="3421"/>
+      </w:tblGrid>
+      <w:tr>
+        <w:trPr>
+          <w:tblHeader w:val="true"/>
+        </w:trPr>
+        <w:tc>
+          <w:tcPr>
+            <w:tcW w:type="dxa" w:w="650"/>
+            <w:vAlign w:val="center"/>
+            <w:tcMar>
+              <w:top w:w="80" w:type="dxa"/>
+              <w:left w:w="100" w:type="dxa"/>
+              <w:bottom w:w="80" w:type="dxa"/>
+              <w:right w:w="100" w:type="dxa"/>
+            </w:tcMar>
+          </w:tcPr>
+          <w:p>
+            <w:pPr>
+              <w:spacing w:before="0" w:after="0" w:line="252" w:lineRule="auto"/>
+              <w:jc w:val="center"/>
+            </w:pPr>
+            <w:r>
+              <w:rPr>
+                <w:rFonts w:ascii="Times New Roman" w:hAnsi="Times New Roman" w:eastAsia="Times New Roman" w:cs="Times New Roman"/>
                 <w:b/>
                 <w:sz w:val="24"/>
                 <w:szCs w:val="24"/>
               </w:rPr>
-              <w:t>{{ nama }}</w:t>
+              <w:t>No.</w:t>
+            </w:r>
+          </w:p>
+        </w:tc>
+        <w:tc>
+          <w:tcPr>
+            <w:tcW w:type="dxa" w:w="5000"/>
+            <w:vAlign w:val="center"/>
+            <w:tcMar>
+              <w:top w:w="80" w:type="dxa"/>
+              <w:left w:w="100" w:type="dxa"/>
+              <w:bottom w:w="80" w:type="dxa"/>
+              <w:right w:w="100" w:type="dxa"/>
+            </w:tcMar>
+          </w:tcPr>
+          <w:p>
+            <w:pPr>
+              <w:spacing w:before="0" w:after="0" w:line="252" w:lineRule="auto"/>
+              <w:jc w:val="center"/>
+            </w:pPr>
+            <w:r>
+              <w:rPr>
+                <w:rFonts w:ascii="Times New Roman" w:hAnsi="Times New Roman" w:eastAsia="Times New Roman" w:cs="Times New Roman"/>
+                <w:b/>
+                <w:sz w:val="24"/>
+                <w:szCs w:val="24"/>
+              </w:rPr>
+              <w:t>Nama</w:t>
+            </w:r>
+          </w:p>
+        </w:tc>
+        <w:tc>
+          <w:tcPr>
+            <w:tcW w:type="dxa" w:w="3421"/>
+            <w:vAlign w:val="center"/>
+            <w:tcMar>
+              <w:top w:w="80" w:type="dxa"/>
+              <w:left w:w="100" w:type="dxa"/>
+              <w:bottom w:w="80" w:type="dxa"/>
+              <w:right w:w="100" w:type="dxa"/>
+            </w:tcMar>
+          </w:tcPr>
+          <w:p>
+            <w:pPr>
+              <w:spacing w:before="0" w:after="0" w:line="252" w:lineRule="auto"/>
+              <w:jc w:val="center"/>
+            </w:pPr>
+            <w:r>
+              <w:rPr>
+                <w:rFonts w:ascii="Times New Roman" w:hAnsi="Times New Roman" w:eastAsia="Times New Roman" w:cs="Times New Roman"/>
+                <w:b/>
+                <w:sz w:val="24"/>
+                <w:szCs w:val="24"/>
+              </w:rPr>
+              <w:t>Jabatan</w:t>
             </w:r>
           </w:p>
         </w:tc>
       </w:tr>
+      <w:tr>
+        <w:tc>
+          <w:tcPr>
+            <w:tcW w:type="dxa" w:w="650"/>
+            <w:vAlign w:val="center"/>
+            <w:tcMar>
+              <w:top w:w="80" w:type="dxa"/>
+              <w:left w:w="100" w:type="dxa"/>
+              <w:bottom w:w="80" w:type="dxa"/>
+              <w:right w:w="100" w:type="dxa"/>
+            </w:tcMar>
+          </w:tcPr>
+          <w:p>
+            <w:pPr>
+              <w:spacing w:before="0" w:after="0" w:line="252" w:lineRule="auto"/>
+              <w:jc w:val="left"/>
+            </w:pPr>
+            <w:r>
+              <w:rPr>
+                <w:rFonts w:ascii="Times New Roman" w:hAnsi="Times New Roman" w:eastAsia="Times New Roman" w:cs="Times New Roman"/>
+                <w:b w:val="0"/>
+                <w:sz w:val="24"/>
+                <w:szCs w:val="24"/>
+              </w:rPr>
+              <w:t>{%tr for person in people %}</w:t>
+            </w:r>
+          </w:p>
+        </w:tc>
+        <w:tc>
+          <w:tcPr>
+            <w:tcW w:type="dxa" w:w="5000"/>
+            <w:vAlign w:val="center"/>
+            <w:tcMar>
+              <w:top w:w="80" w:type="dxa"/>
+              <w:left w:w="100" w:type="dxa"/>
+              <w:bottom w:w="80" w:type="dxa"/>
+              <w:right w:w="100" w:type="dxa"/>
+            </w:tcMar>
+          </w:tcPr>
+          <w:p/>
+        </w:tc>
+        <w:tc>
+          <w:tcPr>
+            <w:tcW w:type="dxa" w:w="3421"/>
+            <w:vAlign w:val="center"/>
+            <w:tcMar>
+              <w:top w:w="80" w:type="dxa"/>
+              <w:left w:w="100" w:type="dxa"/>
+              <w:bottom w:w="80" w:type="dxa"/>
+              <w:right w:w="100" w:type="dxa"/>
+            </w:tcMar>
+          </w:tcPr>
+          <w:p/>
+        </w:tc>
+      </w:tr>
+      <w:tr>
+        <w:tc>
+          <w:tcPr>
+            <w:tcW w:type="dxa" w:w="650"/>
+            <w:vAlign w:val="center"/>
+            <w:tcMar>
+              <w:top w:w="80" w:type="dxa"/>
+              <w:left w:w="100" w:type="dxa"/>
+              <w:bottom w:w="80" w:type="dxa"/>
+              <w:right w:w="100" w:type="dxa"/>
+            </w:tcMar>
+          </w:tcPr>
+          <w:p>
+            <w:pPr>
+              <w:spacing w:before="0" w:after="0" w:line="252" w:lineRule="auto"/>
+              <w:jc w:val="center"/>
+            </w:pPr>
+            <w:r>
+              <w:rPr>
+                <w:rFonts w:ascii="Times New Roman" w:hAnsi="Times New Roman" w:eastAsia="Times New Roman" w:cs="Times New Roman"/>
+                <w:b w:val="0"/>
+                <w:sz w:val="24"/>
+                <w:szCs w:val="24"/>
+              </w:rPr>
+              <w:t>{{ loop.index }}</w:t>
+            </w:r>
+          </w:p>
+        </w:tc>
+        <w:tc>
+          <w:tcPr>
+            <w:tcW w:type="dxa" w:w="5000"/>
+            <w:vAlign w:val="center"/>
+            <w:tcMar>
+              <w:top w:w="80" w:type="dxa"/>
+              <w:left w:w="100" w:type="dxa"/>
+              <w:bottom w:w="80" w:type="dxa"/>
+              <w:right w:w="100" w:type="dxa"/>
+            </w:tcMar>
+          </w:tcPr>
+          <w:p>
+            <w:pPr>
+              <w:spacing w:before="0" w:after="0" w:line="252" w:lineRule="auto"/>
+              <w:jc w:val="left"/>
+            </w:pPr>
+            <w:r>
+              <w:rPr>
+                <w:rFonts w:ascii="Times New Roman" w:hAnsi="Times New Roman" w:eastAsia="Times New Roman" w:cs="Times New Roman"/>
+                <w:b w:val="0"/>
+                <w:sz w:val="24"/>
+                <w:szCs w:val="24"/>
+              </w:rPr>
+              <w:t>{{ person.nama }}</w:t>
+            </w:r>
+          </w:p>
+          <w:p>
+            <w:pPr>
+              <w:spacing w:before="0" w:after="0" w:line="252" w:lineRule="auto"/>
+              <w:jc w:val="left"/>
+            </w:pPr>
+            <w:r>
+              <w:rPr>
+                <w:rFonts w:ascii="Times New Roman" w:hAnsi="Times New Roman" w:eastAsia="Times New Roman" w:cs="Times New Roman"/>
+                <w:b w:val="0"/>
+                <w:sz w:val="24"/>
+                <w:szCs w:val="24"/>
+              </w:rPr>
+              <w:t>NIP. {{ person.nip }}</w:t>
+            </w:r>
+          </w:p>
+        </w:tc>
+        <w:tc>
+          <w:tcPr>
+            <w:tcW w:type="dxa" w:w="3421"/>
+            <w:vAlign w:val="center"/>
+            <w:tcMar>
+              <w:top w:w="80" w:type="dxa"/>
+              <w:left w:w="100" w:type="dxa"/>
+              <w:bottom w:w="80" w:type="dxa"/>
+              <w:right w:w="100" w:type="dxa"/>
+            </w:tcMar>
+          </w:tcPr>
+          <w:p>
+            <w:pPr>
+              <w:spacing w:before="0" w:after="0" w:line="252" w:lineRule="auto"/>
+              <w:jc w:val="left"/>
+            </w:pPr>
+            <w:r>
+              <w:rPr>
+                <w:rFonts w:ascii="Times New Roman" w:hAnsi="Times New Roman" w:eastAsia="Times New Roman" w:cs="Times New Roman"/>
+                <w:b w:val="0"/>
+                <w:sz w:val="24"/>
+                <w:szCs w:val="24"/>
+              </w:rPr>
+              <w:t>{{ person.jabatan }}</w:t>
+            </w:r>
+          </w:p>
+        </w:tc>
+      </w:tr>
+      <w:tr>
+        <w:tc>
+          <w:tcPr>
+            <w:tcW w:type="dxa" w:w="650"/>
+            <w:vAlign w:val="center"/>
+            <w:tcMar>
+              <w:top w:w="80" w:type="dxa"/>
+              <w:left w:w="100" w:type="dxa"/>
+              <w:bottom w:w="80" w:type="dxa"/>
+              <w:right w:w="100" w:type="dxa"/>
+            </w:tcMar>
+          </w:tcPr>
+          <w:p>
+            <w:pPr>
+              <w:spacing w:before="0" w:after="0" w:line="252" w:lineRule="auto"/>
+              <w:jc w:val="left"/>
+            </w:pPr>
+            <w:r>
+              <w:rPr>
+                <w:rFonts w:ascii="Times New Roman" w:hAnsi="Times New Roman" w:eastAsia="Times New Roman" w:cs="Times New Roman"/>
+                <w:b w:val="0"/>
+                <w:sz w:val="24"/>
+                <w:szCs w:val="24"/>
+              </w:rPr>
+              <w:t>{%tr endfor %}</w:t>
+            </w:r>
+          </w:p>
+        </w:tc>
+        <w:tc>
+          <w:tcPr>
+            <w:tcW w:type="dxa" w:w="5000"/>
+            <w:vAlign w:val="center"/>
+            <w:tcMar>
+              <w:top w:w="80" w:type="dxa"/>
+              <w:left w:w="100" w:type="dxa"/>
+              <w:bottom w:w="80" w:type="dxa"/>
+              <w:right w:w="100" w:type="dxa"/>
+            </w:tcMar>
+          </w:tcPr>
+          <w:p/>
+        </w:tc>
+        <w:tc>
+          <w:tcPr>
+            <w:tcW w:type="dxa" w:w="3421"/>
+            <w:vAlign w:val="center"/>
+            <w:tcMar>
+              <w:top w:w="80" w:type="dxa"/>
+              <w:left w:w="100" w:type="dxa"/>
+              <w:bottom w:w="80" w:type="dxa"/>
+              <w:right w:w="100" w:type="dxa"/>
+            </w:tcMar>
+          </w:tcPr>
+          <w:p/>
+        </w:tc>
+      </w:tr>
+    </w:tbl>
+    <w:p>
+      <w:pPr>
+        <w:keepNext/>
+        <w:spacing w:before="120" w:after="0" w:line="276" w:lineRule="auto"/>
+        <w:jc w:val="left"/>
+      </w:pPr>
+      <w:r>
+        <w:rPr>
+          <w:rFonts w:ascii="Times New Roman" w:hAnsi="Times New Roman" w:eastAsia="Times New Roman" w:cs="Times New Roman"/>
+          <w:b/>
+          <w:sz w:val="24"/>
+          <w:u w:val="none"/>
+          <w:szCs w:val="24"/>
+        </w:rPr>
+        <w:t>Untuk:</w:t>
+      </w:r>
+    </w:p>
+    <w:tbl>
+      <w:tblPr>
+        <w:tblW w:type="dxa" w:w="9071"/>
+        <w:jc w:val="left"/>
+        <w:tblLayout w:type="fixed"/>
+        <w:tblLook w:firstColumn="1" w:firstRow="1" w:lastColumn="0" w:lastRow="0" w:noHBand="0" w:noVBand="1" w:val="04A0"/>
+        <w:tblInd w:w="0" w:type="dxa"/>
+        <w:tblBorders>
+          <w:top w:val="nil"/>
+          <w:left w:val="nil"/>
+          <w:bottom w:val="nil"/>
+          <w:right w:val="nil"/>
+          <w:insideH w:val="nil"/>
+          <w:insideV w:val="nil"/>
+        </w:tblBorders>
+      </w:tblPr>
+      <w:tblGrid>
+        <w:gridCol w:w="2948"/>
+        <w:gridCol w:w="227"/>
+        <w:gridCol w:w="5896"/>
+      </w:tblGrid>
       <w:tr>
         <w:tc>
           <w:tcPr>
@@ -306,7 +678,7 @@
                 <w:sz w:val="24"/>
                 <w:szCs w:val="24"/>
               </w:rPr>
-              <w:t>NIP</w:t>
+              <w:t>Uraian Perintah</w:t>
             </w:r>
           </w:p>
         </w:tc>
@@ -372,11 +744,11 @@
             <w:r>
               <w:rPr>
                 <w:rFonts w:ascii="Times New Roman" w:hAnsi="Times New Roman" w:eastAsia="Times New Roman" w:cs="Times New Roman"/>
-                <w:b/>
-                <w:sz w:val="24"/>
-                <w:szCs w:val="24"/>
-              </w:rPr>
-              <w:t>{{ nip }}</w:t>
+                <w:b w:val="0"/>
+                <w:sz w:val="24"/>
+                <w:szCs w:val="24"/>
+              </w:rPr>
+              <w:t>{{ keperluan }}</w:t>
             </w:r>
           </w:p>
         </w:tc>
@@ -413,7 +785,7 @@
                 <w:sz w:val="24"/>
                 <w:szCs w:val="24"/>
               </w:rPr>
-              <w:t>Pangkat / Golongan</w:t>
+              <w:t>Tanggal Mulai</w:t>
             </w:r>
           </w:p>
         </w:tc>
@@ -483,7 +855,7 @@
                 <w:sz w:val="24"/>
                 <w:szCs w:val="24"/>
               </w:rPr>
-              <w:t>{{ golongan }}</w:t>
+              <w:t>{{ tanggal_mulai }}</w:t>
             </w:r>
           </w:p>
         </w:tc>
@@ -520,7 +892,7 @@
                 <w:sz w:val="24"/>
                 <w:szCs w:val="24"/>
               </w:rPr>
-              <w:t>Jabatan</w:t>
+              <w:t>Tanggal Selesai</w:t>
             </w:r>
           </w:p>
         </w:tc>
@@ -590,7 +962,7 @@
                 <w:sz w:val="24"/>
                 <w:szCs w:val="24"/>
               </w:rPr>
-              <w:t>{{ jabatan }}</w:t>
+              <w:t>{{ tanggal_selesai }}</w:t>
             </w:r>
           </w:p>
         </w:tc>
@@ -627,7 +999,7 @@
                 <w:sz w:val="24"/>
                 <w:szCs w:val="24"/>
               </w:rPr>
-              <w:t>Tanggal Tugas</w:t>
+              <w:t>Waktu</w:t>
             </w:r>
           </w:p>
         </w:tc>
@@ -697,7 +1069,7 @@
                 <w:sz w:val="24"/>
                 <w:szCs w:val="24"/>
               </w:rPr>
-              <w:t>{{ tanggal_mulai }}</w:t>
+              <w:t>{{ waktu }}</w:t>
             </w:r>
           </w:p>
         </w:tc>
@@ -734,7 +1106,7 @@
                 <w:sz w:val="24"/>
                 <w:szCs w:val="24"/>
               </w:rPr>
-              <w:t>Sampai Tanggal</w:t>
+              <w:t>Tempat</w:t>
             </w:r>
           </w:p>
         </w:tc>
@@ -804,114 +1176,7 @@
                 <w:sz w:val="24"/>
                 <w:szCs w:val="24"/>
               </w:rPr>
-              <w:t>{{ tanggal_selesai }}</w:t>
-            </w:r>
-          </w:p>
-        </w:tc>
-      </w:tr>
-      <w:tr>
-        <w:tc>
-          <w:tcPr>
-            <w:tcW w:type="dxa" w:w="2948"/>
-            <w:vAlign w:val="center"/>
-            <w:tcMar>
-              <w:top w:w="80" w:type="dxa"/>
-              <w:left w:w="100" w:type="dxa"/>
-              <w:bottom w:w="80" w:type="dxa"/>
-              <w:right w:w="100" w:type="dxa"/>
-            </w:tcMar>
-            <w:tcBorders>
-              <w:top w:val="nil"/>
-              <w:left w:val="nil"/>
-              <w:bottom w:val="nil"/>
-              <w:right w:val="nil"/>
-              <w:insideH w:val="nil"/>
-              <w:insideV w:val="nil"/>
-            </w:tcBorders>
-          </w:tcPr>
-          <w:p>
-            <w:pPr>
-              <w:spacing w:before="0" w:after="0" w:line="276" w:lineRule="auto"/>
-              <w:jc w:val="left"/>
-            </w:pPr>
-            <w:r>
-              <w:rPr>
-                <w:rFonts w:ascii="Times New Roman" w:hAnsi="Times New Roman" w:eastAsia="Times New Roman" w:cs="Times New Roman"/>
-                <w:b w:val="0"/>
-                <w:sz w:val="24"/>
-                <w:szCs w:val="24"/>
-              </w:rPr>
-              <w:t>Uraian / Keperluan Tugas</w:t>
-            </w:r>
-          </w:p>
-        </w:tc>
-        <w:tc>
-          <w:tcPr>
-            <w:tcW w:type="dxa" w:w="227"/>
-            <w:vAlign w:val="center"/>
-            <w:tcMar>
-              <w:top w:w="80" w:type="dxa"/>
-              <w:left w:w="100" w:type="dxa"/>
-              <w:bottom w:w="80" w:type="dxa"/>
-              <w:right w:w="100" w:type="dxa"/>
-            </w:tcMar>
-            <w:tcBorders>
-              <w:top w:val="nil"/>
-              <w:left w:val="nil"/>
-              <w:bottom w:val="nil"/>
-              <w:right w:val="nil"/>
-              <w:insideH w:val="nil"/>
-              <w:insideV w:val="nil"/>
-            </w:tcBorders>
-          </w:tcPr>
-          <w:p>
-            <w:pPr>
-              <w:spacing w:before="0" w:after="0" w:line="276" w:lineRule="auto"/>
-              <w:jc w:val="center"/>
-            </w:pPr>
-            <w:r>
-              <w:rPr>
-                <w:rFonts w:ascii="Times New Roman" w:hAnsi="Times New Roman" w:eastAsia="Times New Roman" w:cs="Times New Roman"/>
-                <w:b w:val="0"/>
-                <w:sz w:val="24"/>
-                <w:szCs w:val="24"/>
-              </w:rPr>
-              <w:t>:</w:t>
-            </w:r>
-          </w:p>
-        </w:tc>
-        <w:tc>
-          <w:tcPr>
-            <w:tcW w:type="dxa" w:w="5896"/>
-            <w:vAlign w:val="center"/>
-            <w:tcMar>
-              <w:top w:w="80" w:type="dxa"/>
-              <w:left w:w="100" w:type="dxa"/>
-              <w:bottom w:w="80" w:type="dxa"/>
-              <w:right w:w="100" w:type="dxa"/>
-            </w:tcMar>
-            <w:tcBorders>
-              <w:top w:val="nil"/>
-              <w:left w:val="nil"/>
-              <w:bottom w:val="nil"/>
-              <w:right w:val="nil"/>
-              <w:insideH w:val="nil"/>
-              <w:insideV w:val="nil"/>
-            </w:tcBorders>
-          </w:tcPr>
-          <w:p>
-            <w:pPr>
-              <w:spacing w:before="0" w:after="0" w:line="276" w:lineRule="auto"/>
-              <w:jc w:val="left"/>
-            </w:pPr>
-            <w:r>
-              <w:rPr>
-                <w:rFonts w:ascii="Times New Roman" w:hAnsi="Times New Roman" w:eastAsia="Times New Roman" w:cs="Times New Roman"/>
-                <w:b w:val="0"/>
-                <w:sz w:val="24"/>
-                <w:szCs w:val="24"/>
-              </w:rPr>
-              <w:t>{{ keperluan }}</w:t>
+              <w:t>{{ tempat_kegiatan }}</w:t>
             </w:r>
           </w:p>
         </w:tc>
@@ -920,7 +1185,7 @@
     <w:p>
       <w:pPr>
         <w:keepNext w:val="0"/>
-        <w:spacing w:before="160" w:after="80" w:line="276" w:lineRule="auto"/>
+        <w:spacing w:before="160" w:after="0" w:line="276" w:lineRule="auto"/>
         <w:jc w:val="both"/>
       </w:pPr>
       <w:r>

</xml_diff>